<commit_message>
Sprint 3 complete — image credits, landing hub, about, privacy policy, dataset audit
</commit_message>
<xml_diff>
--- a/resources/documentation/Additional features.docx
+++ b/resources/documentation/Additional features.docx
@@ -28,225 +28,7 @@
       </w:r>
     </w:p>
     <w:p>
-      <w:r>
-        <w:rPr>
-          <w:rStyle w:val="Heading1Char"/>
-        </w:rPr>
-        <w:t xml:space="preserve">2. </w:t>
-      </w:r>
-      <w:r>
-        <w:rPr>
-          <w:rStyle w:val="Heading1Char"/>
-        </w:rPr>
-        <w:t>MVP 0.2</w:t>
-      </w:r>
-    </w:p>
-    <w:p>
-      <w:pPr>
-        <w:pStyle w:val="ListParagraph"/>
-        <w:numPr>
-          <w:ilvl w:val="0"/>
-          <w:numId w:val="4"/>
-        </w:numPr>
-        <w:rPr>
-          <w:color w:val="3A7C22" w:themeColor="accent6" w:themeShade="BF"/>
-        </w:rPr>
-      </w:pPr>
-      <w:r>
-        <w:rPr>
-          <w:color w:val="3A7C22" w:themeColor="accent6" w:themeShade="BF"/>
-        </w:rPr>
-        <w:t>Local caching of images</w:t>
-      </w:r>
-      <w:r>
-        <w:rPr>
-          <w:color w:val="3A7C22" w:themeColor="accent6" w:themeShade="BF"/>
-        </w:rPr>
-        <w:t xml:space="preserve"> - Done</w:t>
-      </w:r>
-    </w:p>
-    <w:p>
-      <w:pPr>
-        <w:pStyle w:val="ListParagraph"/>
-        <w:numPr>
-          <w:ilvl w:val="0"/>
-          <w:numId w:val="4"/>
-        </w:numPr>
-        <w:rPr>
-          <w:color w:val="3A7C22" w:themeColor="accent6" w:themeShade="BF"/>
-        </w:rPr>
-      </w:pPr>
-      <w:r>
-        <w:rPr>
-          <w:color w:val="3A7C22" w:themeColor="accent6" w:themeShade="BF"/>
-        </w:rPr>
-        <w:t>Filter search by data-base</w:t>
-      </w:r>
-      <w:r>
-        <w:rPr>
-          <w:color w:val="3A7C22" w:themeColor="accent6" w:themeShade="BF"/>
-        </w:rPr>
-        <w:t xml:space="preserve"> - Done</w:t>
-      </w:r>
-    </w:p>
-    <w:p>
-      <w:pPr>
-        <w:pStyle w:val="font-claude-response-body"/>
-        <w:ind w:left="720"/>
-        <w:rPr>
-          <w:b/>
-          <w:bCs/>
-        </w:rPr>
-      </w:pPr>
-      <w:r>
-        <w:rPr>
-          <w:rStyle w:val="Strong"/>
-        </w:rPr>
-        <w:t>Connect to github</w:t>
-      </w:r>
-    </w:p>
-    <w:p>
-      <w:pPr>
-        <w:pStyle w:val="ListParagraph"/>
-        <w:numPr>
-          <w:ilvl w:val="0"/>
-          <w:numId w:val="4"/>
-        </w:numPr>
-        <w:rPr>
-          <w:color w:val="3A7C22" w:themeColor="accent6" w:themeShade="BF"/>
-        </w:rPr>
-      </w:pPr>
-      <w:r>
-        <w:rPr>
-          <w:color w:val="3A7C22" w:themeColor="accent6" w:themeShade="BF"/>
-        </w:rPr>
-        <w:t>Add a locally stored checkbox</w:t>
-      </w:r>
-      <w:r>
-        <w:rPr>
-          <w:color w:val="3A7C22" w:themeColor="accent6" w:themeShade="BF"/>
-        </w:rPr>
-        <w:t xml:space="preserve"> - Done</w:t>
-      </w:r>
-    </w:p>
-    <w:p>
-      <w:pPr>
-        <w:pStyle w:val="ListParagraph"/>
-        <w:numPr>
-          <w:ilvl w:val="0"/>
-          <w:numId w:val="4"/>
-        </w:numPr>
-        <w:rPr>
-          <w:color w:val="3A7C22" w:themeColor="accent6" w:themeShade="BF"/>
-        </w:rPr>
-      </w:pPr>
-      <w:r>
-        <w:rPr>
-          <w:color w:val="3A7C22" w:themeColor="accent6" w:themeShade="BF"/>
-        </w:rPr>
-        <w:t xml:space="preserve">Local common names toggle </w:t>
-      </w:r>
-      <w:proofErr w:type="gramStart"/>
-      <w:r>
-        <w:rPr>
-          <w:color w:val="3A7C22" w:themeColor="accent6" w:themeShade="BF"/>
-        </w:rPr>
-        <w:t>( Brazilian</w:t>
-      </w:r>
-      <w:proofErr w:type="gramEnd"/>
-      <w:r>
-        <w:rPr>
-          <w:color w:val="3A7C22" w:themeColor="accent6" w:themeShade="BF"/>
-        </w:rPr>
-        <w:t xml:space="preserve"> </w:t>
-      </w:r>
-      <w:proofErr w:type="gramStart"/>
-      <w:r>
-        <w:rPr>
-          <w:color w:val="3A7C22" w:themeColor="accent6" w:themeShade="BF"/>
-        </w:rPr>
-        <w:t>Portuguese )</w:t>
-      </w:r>
-      <w:proofErr w:type="gramEnd"/>
-      <w:r>
-        <w:rPr>
-          <w:color w:val="3A7C22" w:themeColor="accent6" w:themeShade="BF"/>
-        </w:rPr>
-        <w:t xml:space="preserve"> – </w:t>
-      </w:r>
-      <w:r>
-        <w:rPr>
-          <w:color w:val="3A7C22" w:themeColor="accent6" w:themeShade="BF"/>
-        </w:rPr>
-        <w:t>Done</w:t>
-      </w:r>
-    </w:p>
-    <w:p>
-      <w:pPr>
-        <w:pStyle w:val="ListParagraph"/>
-        <w:numPr>
-          <w:ilvl w:val="0"/>
-          <w:numId w:val="4"/>
-        </w:numPr>
-        <w:rPr>
-          <w:color w:val="3A7C22" w:themeColor="accent6" w:themeShade="BF"/>
-        </w:rPr>
-      </w:pPr>
-      <w:r>
-        <w:rPr>
-          <w:color w:val="3A7C22" w:themeColor="accent6" w:themeShade="BF"/>
-        </w:rPr>
-        <w:t>Lock to portrait layout</w:t>
-      </w:r>
-      <w:r>
-        <w:rPr>
-          <w:color w:val="3A7C22" w:themeColor="accent6" w:themeShade="BF"/>
-        </w:rPr>
-        <w:t xml:space="preserve"> -done</w:t>
-      </w:r>
-    </w:p>
-    <w:p>
-      <w:pPr>
-        <w:pStyle w:val="ListParagraph"/>
-        <w:numPr>
-          <w:ilvl w:val="0"/>
-          <w:numId w:val="4"/>
-        </w:numPr>
-        <w:rPr>
-          <w:color w:val="3A7C22" w:themeColor="accent6" w:themeShade="BF"/>
-        </w:rPr>
-      </w:pPr>
-      <w:r>
-        <w:rPr>
-          <w:color w:val="3A7C22" w:themeColor="accent6" w:themeShade="BF"/>
-        </w:rPr>
-        <w:t>Add commonly seen species</w:t>
-      </w:r>
-      <w:r>
-        <w:rPr>
-          <w:color w:val="3A7C22" w:themeColor="accent6" w:themeShade="BF"/>
-        </w:rPr>
-        <w:t xml:space="preserve"> checklist</w:t>
-      </w:r>
-      <w:r>
-        <w:rPr>
-          <w:color w:val="3A7C22" w:themeColor="accent6" w:themeShade="BF"/>
-        </w:rPr>
-        <w:t xml:space="preserve"> - Done</w:t>
-      </w:r>
-    </w:p>
-    <w:p>
-      <w:pPr>
-        <w:ind w:left="360"/>
-      </w:pPr>
-    </w:p>
-    <w:p>
-      <w:pPr>
-        <w:pStyle w:val="ListParagraph"/>
-        <w:numPr>
-          <w:ilvl w:val="0"/>
-          <w:numId w:val="8"/>
-        </w:numPr>
+      <w:pPr>
         <w:rPr>
           <w:rStyle w:val="Heading1Char"/>
           <w:rFonts w:asciiTheme="minorHAnsi" w:eastAsiaTheme="minorHAnsi" w:hAnsiTheme="minorHAnsi" w:cstheme="minorBidi"/>
@@ -259,7 +41,225 @@
         <w:rPr>
           <w:rStyle w:val="Heading1Char"/>
         </w:rPr>
-        <w:t>MVP 0.3</w:t>
+        <w:t xml:space="preserve">Sprint </w:t>
+      </w:r>
+      <w:r>
+        <w:rPr>
+          <w:rStyle w:val="Heading1Char"/>
+        </w:rPr>
+        <w:t>2</w:t>
+      </w:r>
+    </w:p>
+    <w:p>
+      <w:pPr>
+        <w:pStyle w:val="ListParagraph"/>
+        <w:numPr>
+          <w:ilvl w:val="0"/>
+          <w:numId w:val="4"/>
+        </w:numPr>
+        <w:rPr>
+          <w:color w:val="3A7C22" w:themeColor="accent6" w:themeShade="BF"/>
+        </w:rPr>
+      </w:pPr>
+      <w:r>
+        <w:rPr>
+          <w:color w:val="3A7C22" w:themeColor="accent6" w:themeShade="BF"/>
+        </w:rPr>
+        <w:t>Local caching of images</w:t>
+      </w:r>
+      <w:r>
+        <w:rPr>
+          <w:color w:val="3A7C22" w:themeColor="accent6" w:themeShade="BF"/>
+        </w:rPr>
+        <w:t xml:space="preserve"> - Done</w:t>
+      </w:r>
+    </w:p>
+    <w:p>
+      <w:pPr>
+        <w:pStyle w:val="ListParagraph"/>
+        <w:numPr>
+          <w:ilvl w:val="0"/>
+          <w:numId w:val="4"/>
+        </w:numPr>
+        <w:rPr>
+          <w:color w:val="3A7C22" w:themeColor="accent6" w:themeShade="BF"/>
+        </w:rPr>
+      </w:pPr>
+      <w:r>
+        <w:rPr>
+          <w:color w:val="3A7C22" w:themeColor="accent6" w:themeShade="BF"/>
+        </w:rPr>
+        <w:t>Filter search by data-base</w:t>
+      </w:r>
+      <w:r>
+        <w:rPr>
+          <w:color w:val="3A7C22" w:themeColor="accent6" w:themeShade="BF"/>
+        </w:rPr>
+        <w:t xml:space="preserve"> </w:t>
+      </w:r>
+      <w:r>
+        <w:rPr>
+          <w:color w:val="3A7C22" w:themeColor="accent6" w:themeShade="BF"/>
+        </w:rPr>
+        <w:t>–</w:t>
+      </w:r>
+      <w:r>
+        <w:rPr>
+          <w:color w:val="3A7C22" w:themeColor="accent6" w:themeShade="BF"/>
+        </w:rPr>
+        <w:t xml:space="preserve"> Done</w:t>
+      </w:r>
+    </w:p>
+    <w:p>
+      <w:pPr>
+        <w:pStyle w:val="ListParagraph"/>
+        <w:numPr>
+          <w:ilvl w:val="0"/>
+          <w:numId w:val="4"/>
+        </w:numPr>
+        <w:rPr>
+          <w:color w:val="3A7C22" w:themeColor="accent6" w:themeShade="BF"/>
+        </w:rPr>
+      </w:pPr>
+      <w:r>
+        <w:rPr>
+          <w:color w:val="3A7C22" w:themeColor="accent6" w:themeShade="BF"/>
+        </w:rPr>
+        <w:t>Add a locally stored checkbox</w:t>
+      </w:r>
+      <w:r>
+        <w:rPr>
+          <w:color w:val="3A7C22" w:themeColor="accent6" w:themeShade="BF"/>
+        </w:rPr>
+        <w:t xml:space="preserve"> - Done</w:t>
+      </w:r>
+    </w:p>
+    <w:p>
+      <w:pPr>
+        <w:pStyle w:val="ListParagraph"/>
+        <w:numPr>
+          <w:ilvl w:val="0"/>
+          <w:numId w:val="4"/>
+        </w:numPr>
+        <w:rPr>
+          <w:color w:val="3A7C22" w:themeColor="accent6" w:themeShade="BF"/>
+        </w:rPr>
+      </w:pPr>
+      <w:r>
+        <w:rPr>
+          <w:color w:val="3A7C22" w:themeColor="accent6" w:themeShade="BF"/>
+        </w:rPr>
+        <w:t xml:space="preserve">Local common names toggle </w:t>
+      </w:r>
+      <w:proofErr w:type="gramStart"/>
+      <w:r>
+        <w:rPr>
+          <w:color w:val="3A7C22" w:themeColor="accent6" w:themeShade="BF"/>
+        </w:rPr>
+        <w:t>( Brazilian</w:t>
+      </w:r>
+      <w:proofErr w:type="gramEnd"/>
+      <w:r>
+        <w:rPr>
+          <w:color w:val="3A7C22" w:themeColor="accent6" w:themeShade="BF"/>
+        </w:rPr>
+        <w:t xml:space="preserve"> </w:t>
+      </w:r>
+      <w:proofErr w:type="gramStart"/>
+      <w:r>
+        <w:rPr>
+          <w:color w:val="3A7C22" w:themeColor="accent6" w:themeShade="BF"/>
+        </w:rPr>
+        <w:t>Portuguese )</w:t>
+      </w:r>
+      <w:proofErr w:type="gramEnd"/>
+      <w:r>
+        <w:rPr>
+          <w:color w:val="3A7C22" w:themeColor="accent6" w:themeShade="BF"/>
+        </w:rPr>
+        <w:t xml:space="preserve"> – </w:t>
+      </w:r>
+      <w:r>
+        <w:rPr>
+          <w:color w:val="3A7C22" w:themeColor="accent6" w:themeShade="BF"/>
+        </w:rPr>
+        <w:t>Done</w:t>
+      </w:r>
+    </w:p>
+    <w:p>
+      <w:pPr>
+        <w:pStyle w:val="ListParagraph"/>
+        <w:numPr>
+          <w:ilvl w:val="0"/>
+          <w:numId w:val="4"/>
+        </w:numPr>
+        <w:rPr>
+          <w:color w:val="3A7C22" w:themeColor="accent6" w:themeShade="BF"/>
+        </w:rPr>
+      </w:pPr>
+      <w:r>
+        <w:rPr>
+          <w:color w:val="3A7C22" w:themeColor="accent6" w:themeShade="BF"/>
+        </w:rPr>
+        <w:t>Lock to portrait layout</w:t>
+      </w:r>
+      <w:r>
+        <w:rPr>
+          <w:color w:val="3A7C22" w:themeColor="accent6" w:themeShade="BF"/>
+        </w:rPr>
+        <w:t xml:space="preserve"> -done</w:t>
+      </w:r>
+    </w:p>
+    <w:p>
+      <w:pPr>
+        <w:pStyle w:val="ListParagraph"/>
+        <w:numPr>
+          <w:ilvl w:val="0"/>
+          <w:numId w:val="4"/>
+        </w:numPr>
+        <w:rPr>
+          <w:color w:val="3A7C22" w:themeColor="accent6" w:themeShade="BF"/>
+        </w:rPr>
+      </w:pPr>
+      <w:r>
+        <w:rPr>
+          <w:color w:val="3A7C22" w:themeColor="accent6" w:themeShade="BF"/>
+        </w:rPr>
+        <w:t>Add commonly seen species</w:t>
+      </w:r>
+      <w:r>
+        <w:rPr>
+          <w:color w:val="3A7C22" w:themeColor="accent6" w:themeShade="BF"/>
+        </w:rPr>
+        <w:t xml:space="preserve"> checklist</w:t>
+      </w:r>
+      <w:r>
+        <w:rPr>
+          <w:color w:val="3A7C22" w:themeColor="accent6" w:themeShade="BF"/>
+        </w:rPr>
+        <w:t xml:space="preserve"> - Done</w:t>
+      </w:r>
+    </w:p>
+    <w:p>
+      <w:pPr>
+        <w:ind w:left="360"/>
+      </w:pPr>
+    </w:p>
+    <w:p>
+      <w:pPr>
+        <w:rPr>
+          <w:rStyle w:val="Heading1Char"/>
+          <w:rFonts w:asciiTheme="minorHAnsi" w:eastAsiaTheme="minorHAnsi" w:hAnsiTheme="minorHAnsi" w:cstheme="minorBidi"/>
+          <w:color w:val="auto"/>
+          <w:sz w:val="24"/>
+          <w:szCs w:val="24"/>
+        </w:rPr>
+      </w:pPr>
+      <w:r>
+        <w:rPr>
+          <w:rStyle w:val="Heading1Char"/>
+        </w:rPr>
+        <w:t>Sprint 3</w:t>
       </w:r>
     </w:p>
     <w:p>
@@ -269,8 +269,14 @@
           <w:ilvl w:val="0"/>
           <w:numId w:val="5"/>
         </w:numPr>
-      </w:pPr>
-      <w:r>
+        <w:rPr>
+          <w:color w:val="3A7C22" w:themeColor="accent6" w:themeShade="BF"/>
+        </w:rPr>
+      </w:pPr>
+      <w:r>
+        <w:rPr>
+          <w:color w:val="3A7C22" w:themeColor="accent6" w:themeShade="BF"/>
+        </w:rPr>
         <w:t>Clean-up</w:t>
       </w:r>
     </w:p>
@@ -281,17 +287,41 @@
           <w:ilvl w:val="1"/>
           <w:numId w:val="5"/>
         </w:numPr>
-      </w:pPr>
-      <w:r>
+        <w:rPr>
+          <w:color w:val="3A7C22" w:themeColor="accent6" w:themeShade="BF"/>
+        </w:rPr>
+      </w:pPr>
+      <w:r>
+        <w:rPr>
+          <w:color w:val="3A7C22" w:themeColor="accent6" w:themeShade="BF"/>
+        </w:rPr>
         <w:t xml:space="preserve">Venom </w:t>
       </w:r>
       <w:proofErr w:type="gramStart"/>
       <w:r>
+        <w:rPr>
+          <w:color w:val="3A7C22" w:themeColor="accent6" w:themeShade="BF"/>
+        </w:rPr>
         <w:t>status :</w:t>
       </w:r>
       <w:proofErr w:type="gramEnd"/>
       <w:r>
+        <w:rPr>
+          <w:color w:val="3A7C22" w:themeColor="accent6" w:themeShade="BF"/>
+        </w:rPr>
         <w:t xml:space="preserve"> change to Venom</w:t>
+      </w:r>
+      <w:r>
+        <w:rPr>
+          <w:color w:val="3A7C22" w:themeColor="accent6" w:themeShade="BF"/>
+        </w:rPr>
+        <w:t xml:space="preserve">- </w:t>
+      </w:r>
+      <w:r>
+        <w:rPr>
+          <w:color w:val="3A7C22" w:themeColor="accent6" w:themeShade="BF"/>
+        </w:rPr>
+        <w:t>Done</w:t>
       </w:r>
     </w:p>
     <w:p>
@@ -301,9 +331,27 @@
           <w:ilvl w:val="1"/>
           <w:numId w:val="5"/>
         </w:numPr>
-      </w:pPr>
-      <w:r>
+        <w:rPr>
+          <w:color w:val="3A7C22" w:themeColor="accent6" w:themeShade="BF"/>
+        </w:rPr>
+      </w:pPr>
+      <w:r>
+        <w:rPr>
+          <w:color w:val="3A7C22" w:themeColor="accent6" w:themeShade="BF"/>
+        </w:rPr>
         <w:t>Darken background behind venom status</w:t>
+      </w:r>
+      <w:r>
+        <w:rPr>
+          <w:color w:val="3A7C22" w:themeColor="accent6" w:themeShade="BF"/>
+        </w:rPr>
+        <w:t xml:space="preserve">- </w:t>
+      </w:r>
+      <w:r>
+        <w:rPr>
+          <w:color w:val="3A7C22" w:themeColor="accent6" w:themeShade="BF"/>
+        </w:rPr>
+        <w:t>Done</w:t>
       </w:r>
     </w:p>
     <w:p>
@@ -313,15 +361,15 @@
           <w:ilvl w:val="2"/>
           <w:numId w:val="5"/>
         </w:numPr>
-      </w:pPr>
-      <w:r>
-        <w:t xml:space="preserve"> Green: #</w:t>
-      </w:r>
-      <w:r>
-        <w:t xml:space="preserve"> </w:t>
-      </w:r>
-      <w:r>
-        <w:t>DFF1E2</w:t>
+        <w:rPr>
+          <w:color w:val="3A7C22" w:themeColor="accent6" w:themeShade="BF"/>
+        </w:rPr>
+      </w:pPr>
+      <w:r>
+        <w:rPr>
+          <w:color w:val="3A7C22" w:themeColor="accent6" w:themeShade="BF"/>
+        </w:rPr>
+        <w:t xml:space="preserve"> Green: # DFF1E2</w:t>
       </w:r>
     </w:p>
     <w:p>
@@ -331,15 +379,15 @@
           <w:ilvl w:val="2"/>
           <w:numId w:val="5"/>
         </w:numPr>
-      </w:pPr>
-      <w:r>
-        <w:t>Red: #</w:t>
-      </w:r>
-      <w:r>
-        <w:t xml:space="preserve"> </w:t>
-      </w:r>
-      <w:r>
-        <w:t>FBCDCD</w:t>
+        <w:rPr>
+          <w:color w:val="3A7C22" w:themeColor="accent6" w:themeShade="BF"/>
+        </w:rPr>
+      </w:pPr>
+      <w:r>
+        <w:rPr>
+          <w:color w:val="3A7C22" w:themeColor="accent6" w:themeShade="BF"/>
+        </w:rPr>
+        <w:t>Red: # FBCDCD</w:t>
       </w:r>
     </w:p>
     <w:p>
@@ -349,9 +397,27 @@
           <w:ilvl w:val="1"/>
           <w:numId w:val="5"/>
         </w:numPr>
-      </w:pPr>
-      <w:r>
+        <w:rPr>
+          <w:color w:val="3A7C22" w:themeColor="accent6" w:themeShade="BF"/>
+        </w:rPr>
+      </w:pPr>
+      <w:r>
+        <w:rPr>
+          <w:color w:val="3A7C22" w:themeColor="accent6" w:themeShade="BF"/>
+        </w:rPr>
         <w:t>Change non-venomous icon to smiley face</w:t>
+      </w:r>
+      <w:r>
+        <w:rPr>
+          <w:color w:val="3A7C22" w:themeColor="accent6" w:themeShade="BF"/>
+        </w:rPr>
+        <w:t xml:space="preserve">- </w:t>
+      </w:r>
+      <w:r>
+        <w:rPr>
+          <w:color w:val="3A7C22" w:themeColor="accent6" w:themeShade="BF"/>
+        </w:rPr>
+        <w:t>Done</w:t>
       </w:r>
     </w:p>
     <w:p>
@@ -361,17 +427,27 @@
           <w:ilvl w:val="0"/>
           <w:numId w:val="5"/>
         </w:numPr>
-      </w:pPr>
-      <w:r>
-        <w:t xml:space="preserve">Clicking on the survey in the filter </w:t>
-      </w:r>
-      <w:proofErr w:type="gramStart"/>
-      <w:r>
-        <w:t>opens up</w:t>
-      </w:r>
-      <w:proofErr w:type="gramEnd"/>
-      <w:r>
-        <w:t xml:space="preserve"> the actual paper.</w:t>
+        <w:rPr>
+          <w:color w:val="3A7C22" w:themeColor="accent6" w:themeShade="BF"/>
+        </w:rPr>
+      </w:pPr>
+      <w:r>
+        <w:rPr>
+          <w:color w:val="3A7C22" w:themeColor="accent6" w:themeShade="BF"/>
+        </w:rPr>
+        <w:t xml:space="preserve">Connect to Git. </w:t>
+      </w:r>
+      <w:r>
+        <w:rPr>
+          <w:color w:val="3A7C22" w:themeColor="accent6" w:themeShade="BF"/>
+        </w:rPr>
+        <w:t xml:space="preserve">- </w:t>
+      </w:r>
+      <w:r>
+        <w:rPr>
+          <w:color w:val="3A7C22" w:themeColor="accent6" w:themeShade="BF"/>
+        </w:rPr>
+        <w:t>Done</w:t>
       </w:r>
     </w:p>
     <w:p>
@@ -381,20 +457,33 @@
           <w:ilvl w:val="0"/>
           <w:numId w:val="5"/>
         </w:numPr>
-      </w:pPr>
-      <w:r>
-        <w:t xml:space="preserve">Full </w:t>
-      </w:r>
-      <w:proofErr w:type="spellStart"/>
-      <w:r>
-        <w:t>Pr_BR</w:t>
-      </w:r>
-      <w:proofErr w:type="spellEnd"/>
-      <w:r>
+        <w:rPr>
+          <w:color w:val="3A7C22" w:themeColor="accent6" w:themeShade="BF"/>
+        </w:rPr>
+      </w:pPr>
+      <w:r>
+        <w:rPr>
+          <w:color w:val="3A7C22" w:themeColor="accent6" w:themeShade="BF"/>
+        </w:rPr>
+        <w:t>About page</w:t>
+      </w:r>
+      <w:r>
+        <w:rPr>
+          <w:color w:val="3A7C22" w:themeColor="accent6" w:themeShade="BF"/>
+        </w:rPr>
         <w:t xml:space="preserve"> </w:t>
       </w:r>
       <w:r>
-        <w:t>Localization</w:t>
+        <w:rPr>
+          <w:color w:val="3A7C22" w:themeColor="accent6" w:themeShade="BF"/>
+        </w:rPr>
+        <w:t>–</w:t>
+      </w:r>
+      <w:r>
+        <w:rPr>
+          <w:color w:val="3A7C22" w:themeColor="accent6" w:themeShade="BF"/>
+        </w:rPr>
+        <w:t xml:space="preserve"> refine</w:t>
       </w:r>
     </w:p>
     <w:p>
@@ -404,15 +493,52 @@
           <w:ilvl w:val="0"/>
           <w:numId w:val="5"/>
         </w:numPr>
-      </w:pPr>
-      <w:r>
-        <w:t>Sightings map</w:t>
+        <w:rPr>
+          <w:color w:val="3A7C22" w:themeColor="accent6" w:themeShade="BF"/>
+        </w:rPr>
+      </w:pPr>
+      <w:r>
+        <w:rPr>
+          <w:color w:val="3A7C22" w:themeColor="accent6" w:themeShade="BF"/>
+        </w:rPr>
+        <w:t xml:space="preserve">Privacy policy </w:t>
       </w:r>
     </w:p>
     <w:p>
       <w:pPr>
         <w:pStyle w:val="ListParagraph"/>
-      </w:pPr>
+        <w:numPr>
+          <w:ilvl w:val="1"/>
+          <w:numId w:val="5"/>
+        </w:numPr>
+        <w:rPr>
+          <w:color w:val="3A7C22" w:themeColor="accent6" w:themeShade="BF"/>
+        </w:rPr>
+      </w:pPr>
+      <w:r>
+        <w:rPr>
+          <w:color w:val="3A7C22" w:themeColor="accent6" w:themeShade="BF"/>
+        </w:rPr>
+        <w:t>In app</w:t>
+      </w:r>
+    </w:p>
+    <w:p>
+      <w:pPr>
+        <w:pStyle w:val="ListParagraph"/>
+        <w:numPr>
+          <w:ilvl w:val="1"/>
+          <w:numId w:val="5"/>
+        </w:numPr>
+        <w:rPr>
+          <w:color w:val="3A7C22" w:themeColor="accent6" w:themeShade="BF"/>
+        </w:rPr>
+      </w:pPr>
+      <w:r>
+        <w:rPr>
+          <w:color w:val="3A7C22" w:themeColor="accent6" w:themeShade="BF"/>
+        </w:rPr>
+        <w:t>HTML</w:t>
+      </w:r>
     </w:p>
     <w:p>
       <w:pPr>
@@ -421,6 +547,103 @@
           <w:ilvl w:val="0"/>
           <w:numId w:val="5"/>
         </w:numPr>
+      </w:pPr>
+      <w:r>
+        <w:t xml:space="preserve">Full </w:t>
+      </w:r>
+      <w:proofErr w:type="spellStart"/>
+      <w:r>
+        <w:t>Pr_BR</w:t>
+      </w:r>
+      <w:proofErr w:type="spellEnd"/>
+      <w:r>
+        <w:t xml:space="preserve"> </w:t>
+      </w:r>
+      <w:r>
+        <w:t>Localization</w:t>
+      </w:r>
+      <w:r>
+        <w:t xml:space="preserve"> </w:t>
+      </w:r>
+    </w:p>
+    <w:p>
+      <w:pPr>
+        <w:pStyle w:val="ListParagraph"/>
+        <w:numPr>
+          <w:ilvl w:val="0"/>
+          <w:numId w:val="5"/>
+        </w:numPr>
+        <w:rPr>
+          <w:color w:val="3A7C22" w:themeColor="accent6" w:themeShade="BF"/>
+        </w:rPr>
+      </w:pPr>
+      <w:r>
+        <w:rPr>
+          <w:color w:val="3A7C22" w:themeColor="accent6" w:themeShade="BF"/>
+        </w:rPr>
+        <w:t>Double check species data base and images</w:t>
+      </w:r>
+      <w:r>
+        <w:rPr>
+          <w:color w:val="3A7C22" w:themeColor="accent6" w:themeShade="BF"/>
+        </w:rPr>
+        <w:t xml:space="preserve"> - Done</w:t>
+      </w:r>
+    </w:p>
+    <w:p>
+      <w:pPr>
+        <w:pStyle w:val="font-claude-response-body"/>
+        <w:numPr>
+          <w:ilvl w:val="0"/>
+          <w:numId w:val="5"/>
+        </w:numPr>
+        <w:rPr>
+          <w:rStyle w:val="Strong"/>
+          <w:b w:val="0"/>
+          <w:bCs w:val="0"/>
+          <w:color w:val="3A7C22" w:themeColor="accent6" w:themeShade="BF"/>
+        </w:rPr>
+      </w:pPr>
+      <w:r>
+        <w:rPr>
+          <w:rStyle w:val="Strong"/>
+          <w:b w:val="0"/>
+          <w:bCs w:val="0"/>
+          <w:color w:val="3A7C22" w:themeColor="accent6" w:themeShade="BF"/>
+        </w:rPr>
+        <w:t>Ru</w:t>
+      </w:r>
+      <w:r>
+        <w:rPr>
+          <w:rStyle w:val="Strong"/>
+          <w:b w:val="0"/>
+          <w:bCs w:val="0"/>
+          <w:color w:val="3A7C22" w:themeColor="accent6" w:themeShade="BF"/>
+        </w:rPr>
+        <w:t>n a check for iNaturalist image permissions</w:t>
+      </w:r>
+      <w:r>
+        <w:rPr>
+          <w:rStyle w:val="Strong"/>
+          <w:b w:val="0"/>
+          <w:bCs w:val="0"/>
+          <w:color w:val="3A7C22" w:themeColor="accent6" w:themeShade="BF"/>
+        </w:rPr>
+        <w:t xml:space="preserve"> - Done</w:t>
+      </w:r>
+    </w:p>
+    <w:p>
+      <w:pPr>
+        <w:pStyle w:val="ListParagraph"/>
+      </w:pPr>
+    </w:p>
+    <w:p>
+      <w:pPr>
+        <w:pStyle w:val="ListParagraph"/>
+      </w:pPr>
+    </w:p>
+    <w:p>
+      <w:pPr>
         <w:rPr>
           <w:rStyle w:val="Strong"/>
           <w:rFonts w:asciiTheme="majorHAnsi" w:eastAsiaTheme="majorEastAsia" w:hAnsiTheme="majorHAnsi" w:cstheme="majorBidi"/>
@@ -435,7 +658,7 @@
         <w:rPr>
           <w:rStyle w:val="Heading1Char"/>
         </w:rPr>
-        <w:t>MVP 0.4</w:t>
+        <w:t>Sprint 4</w:t>
       </w:r>
     </w:p>
     <w:p>
@@ -504,6 +727,23 @@
           <w:bCs w:val="0"/>
         </w:rPr>
         <w:t>Automated image request mail</w:t>
+      </w:r>
+    </w:p>
+    <w:p>
+      <w:pPr>
+        <w:pStyle w:val="ListParagraph"/>
+        <w:numPr>
+          <w:ilvl w:val="0"/>
+          <w:numId w:val="6"/>
+        </w:numPr>
+        <w:rPr>
+          <w:rStyle w:val="Strong"/>
+          <w:b w:val="0"/>
+          <w:bCs w:val="0"/>
+        </w:rPr>
+      </w:pPr>
+      <w:r>
+        <w:t>Sightings map</w:t>
       </w:r>
     </w:p>
     <w:p>
@@ -575,6 +815,7 @@
         <w:rPr>
           <w:rStyle w:val="Heading1Char"/>
         </w:rPr>
+        <w:lastRenderedPageBreak/>
         <w:t xml:space="preserve">App </w:t>
       </w:r>
       <w:proofErr w:type="gramStart"/>
@@ -1162,6 +1403,7 @@
         </w:numPr>
       </w:pPr>
       <w:r>
+        <w:lastRenderedPageBreak/>
         <w:t>Attach the current handover doc + MasterDoc_0_3.docx</w:t>
       </w:r>
     </w:p>
@@ -3115,6 +3357,11 @@
       <w14:ligatures w14:val="none"/>
     </w:rPr>
   </w:style>
+  <w:style w:type="character" w:customStyle="1" w:styleId="token">
+    <w:name w:val="token"/>
+    <w:basedOn w:val="DefaultParagraphFont"/>
+    <w:rsid w:val="0024355A"/>
+  </w:style>
 </w:styles>
 </file>
 

</xml_diff>

<commit_message>
Sprint 4: full localisation en + pt-BR — String Catalog, locale injection, LocaleManager, all UI strings translated
</commit_message>
<xml_diff>
--- a/resources/documentation/Additional features.docx
+++ b/resources/documentation/Additional features.docx
@@ -41,13 +41,7 @@
         <w:rPr>
           <w:rStyle w:val="Heading1Char"/>
         </w:rPr>
-        <w:t xml:space="preserve">Sprint </w:t>
-      </w:r>
-      <w:r>
-        <w:rPr>
-          <w:rStyle w:val="Heading1Char"/>
-        </w:rPr>
-        <w:t>2</w:t>
+        <w:t>Sprint 2</w:t>
       </w:r>
     </w:p>
     <w:p>
@@ -611,16 +605,7 @@
           <w:bCs w:val="0"/>
           <w:color w:val="3A7C22" w:themeColor="accent6" w:themeShade="BF"/>
         </w:rPr>
-        <w:t>Ru</w:t>
-      </w:r>
-      <w:r>
-        <w:rPr>
-          <w:rStyle w:val="Strong"/>
-          <w:b w:val="0"/>
-          <w:bCs w:val="0"/>
-          <w:color w:val="3A7C22" w:themeColor="accent6" w:themeShade="BF"/>
-        </w:rPr>
-        <w:t>n a check for iNaturalist image permissions</w:t>
+        <w:t>Run a check for iNaturalist image permissions</w:t>
       </w:r>
       <w:r>
         <w:rPr>

</xml_diff>

<commit_message>
Sprint 5: update submodule — all images unlocked
</commit_message>
<xml_diff>
--- a/resources/documentation/Additional features.docx
+++ b/resources/documentation/Additional features.docx
@@ -495,132 +495,47 @@
         <w:rPr>
           <w:color w:val="3A7C22" w:themeColor="accent6" w:themeShade="BF"/>
         </w:rPr>
-        <w:t xml:space="preserve">Privacy policy </w:t>
-      </w:r>
-    </w:p>
-    <w:p>
-      <w:pPr>
-        <w:pStyle w:val="ListParagraph"/>
-        <w:numPr>
-          <w:ilvl w:val="1"/>
-          <w:numId w:val="5"/>
-        </w:numPr>
-        <w:rPr>
-          <w:color w:val="3A7C22" w:themeColor="accent6" w:themeShade="BF"/>
-        </w:rPr>
-      </w:pPr>
-      <w:r>
-        <w:rPr>
-          <w:color w:val="3A7C22" w:themeColor="accent6" w:themeShade="BF"/>
-        </w:rPr>
-        <w:t>In app</w:t>
-      </w:r>
-    </w:p>
-    <w:p>
-      <w:pPr>
-        <w:pStyle w:val="ListParagraph"/>
-        <w:numPr>
-          <w:ilvl w:val="1"/>
-          <w:numId w:val="5"/>
-        </w:numPr>
-        <w:rPr>
-          <w:color w:val="3A7C22" w:themeColor="accent6" w:themeShade="BF"/>
-        </w:rPr>
-      </w:pPr>
-      <w:r>
-        <w:rPr>
-          <w:color w:val="3A7C22" w:themeColor="accent6" w:themeShade="BF"/>
-        </w:rPr>
-        <w:t>HTML</w:t>
-      </w:r>
-    </w:p>
-    <w:p>
-      <w:pPr>
-        <w:pStyle w:val="ListParagraph"/>
+        <w:t>Double check species data base and images</w:t>
+      </w:r>
+      <w:r>
+        <w:rPr>
+          <w:color w:val="3A7C22" w:themeColor="accent6" w:themeShade="BF"/>
+        </w:rPr>
+        <w:t xml:space="preserve"> - Done</w:t>
+      </w:r>
+    </w:p>
+    <w:p>
+      <w:pPr>
+        <w:pStyle w:val="font-claude-response-body"/>
         <w:numPr>
           <w:ilvl w:val="0"/>
           <w:numId w:val="5"/>
         </w:numPr>
-      </w:pPr>
-      <w:r>
-        <w:t xml:space="preserve">Full </w:t>
-      </w:r>
-      <w:proofErr w:type="spellStart"/>
-      <w:r>
-        <w:t>Pr_BR</w:t>
-      </w:r>
-      <w:proofErr w:type="spellEnd"/>
-      <w:r>
-        <w:t xml:space="preserve"> </w:t>
-      </w:r>
-      <w:r>
-        <w:t>Localization</w:t>
-      </w:r>
-      <w:r>
-        <w:t xml:space="preserve"> </w:t>
-      </w:r>
-    </w:p>
-    <w:p>
-      <w:pPr>
-        <w:pStyle w:val="ListParagraph"/>
-        <w:numPr>
-          <w:ilvl w:val="0"/>
-          <w:numId w:val="5"/>
-        </w:numPr>
-        <w:rPr>
-          <w:color w:val="3A7C22" w:themeColor="accent6" w:themeShade="BF"/>
-        </w:rPr>
-      </w:pPr>
-      <w:r>
-        <w:rPr>
-          <w:color w:val="3A7C22" w:themeColor="accent6" w:themeShade="BF"/>
-        </w:rPr>
-        <w:t>Double check species data base and images</w:t>
-      </w:r>
-      <w:r>
-        <w:rPr>
+        <w:rPr>
+          <w:rStyle w:val="Strong"/>
+          <w:b w:val="0"/>
+          <w:bCs w:val="0"/>
+          <w:color w:val="3A7C22" w:themeColor="accent6" w:themeShade="BF"/>
+        </w:rPr>
+      </w:pPr>
+      <w:r>
+        <w:rPr>
+          <w:rStyle w:val="Strong"/>
+          <w:b w:val="0"/>
+          <w:bCs w:val="0"/>
+          <w:color w:val="3A7C22" w:themeColor="accent6" w:themeShade="BF"/>
+        </w:rPr>
+        <w:t>Run a check for iNaturalist image permissions</w:t>
+      </w:r>
+      <w:r>
+        <w:rPr>
+          <w:rStyle w:val="Strong"/>
+          <w:b w:val="0"/>
+          <w:bCs w:val="0"/>
           <w:color w:val="3A7C22" w:themeColor="accent6" w:themeShade="BF"/>
         </w:rPr>
         <w:t xml:space="preserve"> - Done</w:t>
       </w:r>
-    </w:p>
-    <w:p>
-      <w:pPr>
-        <w:pStyle w:val="font-claude-response-body"/>
-        <w:numPr>
-          <w:ilvl w:val="0"/>
-          <w:numId w:val="5"/>
-        </w:numPr>
-        <w:rPr>
-          <w:rStyle w:val="Strong"/>
-          <w:b w:val="0"/>
-          <w:bCs w:val="0"/>
-          <w:color w:val="3A7C22" w:themeColor="accent6" w:themeShade="BF"/>
-        </w:rPr>
-      </w:pPr>
-      <w:r>
-        <w:rPr>
-          <w:rStyle w:val="Strong"/>
-          <w:b w:val="0"/>
-          <w:bCs w:val="0"/>
-          <w:color w:val="3A7C22" w:themeColor="accent6" w:themeShade="BF"/>
-        </w:rPr>
-        <w:t>Run a check for iNaturalist image permissions</w:t>
-      </w:r>
-      <w:r>
-        <w:rPr>
-          <w:rStyle w:val="Strong"/>
-          <w:b w:val="0"/>
-          <w:bCs w:val="0"/>
-          <w:color w:val="3A7C22" w:themeColor="accent6" w:themeShade="BF"/>
-        </w:rPr>
-        <w:t xml:space="preserve"> - Done</w:t>
-      </w:r>
-    </w:p>
-    <w:p>
-      <w:pPr>
-        <w:pStyle w:val="ListParagraph"/>
-      </w:pPr>
     </w:p>
     <w:p>
       <w:pPr>
@@ -643,149 +558,120 @@
         <w:rPr>
           <w:rStyle w:val="Heading1Char"/>
         </w:rPr>
-        <w:t>Sprint 4</w:t>
-      </w:r>
-    </w:p>
-    <w:p>
-      <w:pPr>
-        <w:pStyle w:val="font-claude-response-body"/>
+        <w:t xml:space="preserve">Sprint </w:t>
+      </w:r>
+      <w:r>
+        <w:rPr>
+          <w:rStyle w:val="Heading1Char"/>
+        </w:rPr>
+        <w:t>4</w:t>
+      </w:r>
+    </w:p>
+    <w:p>
+      <w:pPr>
+        <w:pStyle w:val="ListParagraph"/>
         <w:numPr>
           <w:ilvl w:val="0"/>
-          <w:numId w:val="6"/>
-        </w:numPr>
-        <w:rPr>
-          <w:rStyle w:val="Strong"/>
-          <w:b w:val="0"/>
-          <w:bCs w:val="0"/>
-        </w:rPr>
-      </w:pPr>
-      <w:r>
-        <w:rPr>
-          <w:rStyle w:val="Strong"/>
-          <w:b w:val="0"/>
-          <w:bCs w:val="0"/>
-        </w:rPr>
-        <w:t>Run</w:t>
-      </w:r>
-      <w:r>
-        <w:rPr>
-          <w:rStyle w:val="Strong"/>
-          <w:b w:val="0"/>
-          <w:bCs w:val="0"/>
-        </w:rPr>
-        <w:t xml:space="preserve"> a check for iNaturalist </w:t>
-      </w:r>
-      <w:r>
-        <w:rPr>
-          <w:rStyle w:val="Strong"/>
-          <w:b w:val="0"/>
-          <w:bCs w:val="0"/>
-        </w:rPr>
-        <w:t xml:space="preserve">image </w:t>
-      </w:r>
-      <w:r>
-        <w:rPr>
-          <w:rStyle w:val="Strong"/>
-          <w:b w:val="0"/>
-          <w:bCs w:val="0"/>
-        </w:rPr>
-        <w:t>permissions</w:t>
-      </w:r>
-    </w:p>
-    <w:p>
-      <w:pPr>
-        <w:pStyle w:val="font-claude-response-body"/>
+          <w:numId w:val="9"/>
+        </w:numPr>
+        <w:rPr>
+          <w:color w:val="3A7C22" w:themeColor="accent6" w:themeShade="BF"/>
+        </w:rPr>
+      </w:pPr>
+      <w:r>
+        <w:rPr>
+          <w:color w:val="3A7C22" w:themeColor="accent6" w:themeShade="BF"/>
+        </w:rPr>
+        <w:t xml:space="preserve">Full </w:t>
+      </w:r>
+      <w:proofErr w:type="spellStart"/>
+      <w:r>
+        <w:rPr>
+          <w:color w:val="3A7C22" w:themeColor="accent6" w:themeShade="BF"/>
+        </w:rPr>
+        <w:t>Pr_BR</w:t>
+      </w:r>
+      <w:proofErr w:type="spellEnd"/>
+      <w:r>
+        <w:rPr>
+          <w:color w:val="3A7C22" w:themeColor="accent6" w:themeShade="BF"/>
+        </w:rPr>
+        <w:t xml:space="preserve"> Localization </w:t>
+      </w:r>
+      <w:r>
+        <w:rPr>
+          <w:color w:val="3A7C22" w:themeColor="accent6" w:themeShade="BF"/>
+        </w:rPr>
+        <w:t>–</w:t>
+      </w:r>
+      <w:r>
+        <w:rPr>
+          <w:color w:val="3A7C22" w:themeColor="accent6" w:themeShade="BF"/>
+        </w:rPr>
+        <w:t xml:space="preserve"> done</w:t>
+      </w:r>
+    </w:p>
+    <w:p>
+      <w:pPr>
+        <w:pStyle w:val="ListParagraph"/>
+        <w:numPr>
+          <w:ilvl w:val="0"/>
+          <w:numId w:val="9"/>
+        </w:numPr>
+        <w:rPr>
+          <w:color w:val="3A7C22" w:themeColor="accent6" w:themeShade="BF"/>
+        </w:rPr>
+      </w:pPr>
+      <w:r>
+        <w:rPr>
+          <w:color w:val="3A7C22" w:themeColor="accent6" w:themeShade="BF"/>
+        </w:rPr>
+        <w:t xml:space="preserve">Privacy policy </w:t>
+      </w:r>
+    </w:p>
+    <w:p>
+      <w:pPr>
+        <w:pStyle w:val="ListParagraph"/>
         <w:numPr>
           <w:ilvl w:val="1"/>
-          <w:numId w:val="6"/>
-        </w:numPr>
-        <w:rPr>
-          <w:rStyle w:val="Strong"/>
-          <w:b w:val="0"/>
-          <w:bCs w:val="0"/>
-        </w:rPr>
-      </w:pPr>
-      <w:r>
-        <w:rPr>
-          <w:rStyle w:val="Strong"/>
-          <w:b w:val="0"/>
-          <w:bCs w:val="0"/>
-        </w:rPr>
-        <w:t>Automated image request mail</w:t>
+          <w:numId w:val="9"/>
+        </w:numPr>
+        <w:rPr>
+          <w:color w:val="3A7C22" w:themeColor="accent6" w:themeShade="BF"/>
+        </w:rPr>
+      </w:pPr>
+      <w:r>
+        <w:rPr>
+          <w:color w:val="3A7C22" w:themeColor="accent6" w:themeShade="BF"/>
+        </w:rPr>
+        <w:t>In app</w:t>
       </w:r>
     </w:p>
     <w:p>
       <w:pPr>
         <w:pStyle w:val="ListParagraph"/>
         <w:numPr>
-          <w:ilvl w:val="0"/>
-          <w:numId w:val="6"/>
-        </w:numPr>
-        <w:rPr>
-          <w:rStyle w:val="Strong"/>
-          <w:b w:val="0"/>
-          <w:bCs w:val="0"/>
-        </w:rPr>
-      </w:pPr>
-      <w:r>
-        <w:t>Sightings map</w:t>
-      </w:r>
-    </w:p>
-    <w:p>
-      <w:pPr>
-        <w:pStyle w:val="font-claude-response-body"/>
-        <w:numPr>
-          <w:ilvl w:val="0"/>
-          <w:numId w:val="6"/>
-        </w:numPr>
-        <w:rPr>
-          <w:rStyle w:val="Strong"/>
-          <w:b w:val="0"/>
-          <w:bCs w:val="0"/>
-        </w:rPr>
-      </w:pPr>
-      <w:r>
-        <w:rPr>
-          <w:rStyle w:val="Strong"/>
-          <w:b w:val="0"/>
-          <w:bCs w:val="0"/>
-        </w:rPr>
-        <w:t xml:space="preserve">Ability to upload </w:t>
-      </w:r>
-      <w:r>
-        <w:rPr>
-          <w:rStyle w:val="Strong"/>
-          <w:b w:val="0"/>
-          <w:bCs w:val="0"/>
-        </w:rPr>
-        <w:t xml:space="preserve">custom </w:t>
-      </w:r>
-      <w:r>
-        <w:rPr>
-          <w:rStyle w:val="Strong"/>
-          <w:b w:val="0"/>
-          <w:bCs w:val="0"/>
-        </w:rPr>
-        <w:t>user images</w:t>
-      </w:r>
-    </w:p>
-    <w:p>
-      <w:pPr>
-        <w:pStyle w:val="font-claude-response-body"/>
-        <w:rPr>
-          <w:rStyle w:val="Strong"/>
-          <w:b w:val="0"/>
-          <w:bCs w:val="0"/>
-        </w:rPr>
-      </w:pPr>
+          <w:ilvl w:val="1"/>
+          <w:numId w:val="9"/>
+        </w:numPr>
+        <w:rPr>
+          <w:color w:val="3A7C22" w:themeColor="accent6" w:themeShade="BF"/>
+        </w:rPr>
+      </w:pPr>
+      <w:r>
+        <w:rPr>
+          <w:color w:val="3A7C22" w:themeColor="accent6" w:themeShade="BF"/>
+        </w:rPr>
+        <w:t>HTML</w:t>
+      </w:r>
     </w:p>
     <w:p>
       <w:pPr>
         <w:pStyle w:val="ListParagraph"/>
-        <w:numPr>
-          <w:ilvl w:val="0"/>
-          <w:numId w:val="5"/>
-        </w:numPr>
+      </w:pPr>
+    </w:p>
+    <w:p>
+      <w:pPr>
         <w:rPr>
           <w:rStyle w:val="Strong"/>
           <w:rFonts w:asciiTheme="majorHAnsi" w:eastAsiaTheme="majorEastAsia" w:hAnsiTheme="majorHAnsi" w:cstheme="majorBidi"/>
@@ -800,27 +686,132 @@
         <w:rPr>
           <w:rStyle w:val="Heading1Char"/>
         </w:rPr>
-        <w:lastRenderedPageBreak/>
-        <w:t xml:space="preserve">App </w:t>
-      </w:r>
-      <w:proofErr w:type="gramStart"/>
+        <w:t xml:space="preserve">Sprint </w:t>
+      </w:r>
       <w:r>
         <w:rPr>
           <w:rStyle w:val="Heading1Char"/>
         </w:rPr>
-        <w:t>store</w:t>
-      </w:r>
-      <w:proofErr w:type="gramEnd"/>
+        <w:t>5</w:t>
+      </w:r>
       <w:r>
         <w:rPr>
           <w:rStyle w:val="Heading1Char"/>
         </w:rPr>
-        <w:t xml:space="preserve"> go-live</w:t>
+        <w:t xml:space="preserve"> – </w:t>
+      </w:r>
+      <w:r>
+        <w:rPr>
+          <w:rStyle w:val="Heading1Char"/>
+          <w:sz w:val="22"/>
+          <w:szCs w:val="22"/>
+        </w:rPr>
+        <w:t>Go live blockers closed</w:t>
       </w:r>
     </w:p>
     <w:p>
       <w:pPr>
         <w:pStyle w:val="font-claude-response-body"/>
+        <w:numPr>
+          <w:ilvl w:val="0"/>
+          <w:numId w:val="6"/>
+        </w:numPr>
+        <w:rPr>
+          <w:rStyle w:val="Strong"/>
+          <w:b w:val="0"/>
+          <w:bCs w:val="0"/>
+        </w:rPr>
+      </w:pPr>
+      <w:r>
+        <w:rPr>
+          <w:rStyle w:val="Strong"/>
+          <w:b w:val="0"/>
+          <w:bCs w:val="0"/>
+        </w:rPr>
+        <w:t>Run</w:t>
+      </w:r>
+      <w:r>
+        <w:rPr>
+          <w:rStyle w:val="Strong"/>
+          <w:b w:val="0"/>
+          <w:bCs w:val="0"/>
+        </w:rPr>
+        <w:t xml:space="preserve"> a check for iNaturalist </w:t>
+      </w:r>
+      <w:r>
+        <w:rPr>
+          <w:rStyle w:val="Strong"/>
+          <w:b w:val="0"/>
+          <w:bCs w:val="0"/>
+        </w:rPr>
+        <w:t xml:space="preserve">image </w:t>
+      </w:r>
+      <w:r>
+        <w:rPr>
+          <w:rStyle w:val="Strong"/>
+          <w:b w:val="0"/>
+          <w:bCs w:val="0"/>
+        </w:rPr>
+        <w:t>permissions</w:t>
+      </w:r>
+    </w:p>
+    <w:p>
+      <w:pPr>
+        <w:pStyle w:val="font-claude-response-body"/>
+        <w:numPr>
+          <w:ilvl w:val="1"/>
+          <w:numId w:val="6"/>
+        </w:numPr>
+        <w:rPr>
+          <w:rStyle w:val="Strong"/>
+          <w:b w:val="0"/>
+          <w:bCs w:val="0"/>
+        </w:rPr>
+      </w:pPr>
+      <w:r>
+        <w:rPr>
+          <w:rStyle w:val="Strong"/>
+          <w:b w:val="0"/>
+          <w:bCs w:val="0"/>
+        </w:rPr>
+        <w:t>Automated image request mail</w:t>
+      </w:r>
+    </w:p>
+    <w:p>
+      <w:pPr>
+        <w:pStyle w:val="font-claude-response-body"/>
+        <w:numPr>
+          <w:ilvl w:val="0"/>
+          <w:numId w:val="6"/>
+        </w:numPr>
+        <w:rPr>
+          <w:rStyle w:val="Strong"/>
+          <w:b w:val="0"/>
+          <w:bCs w:val="0"/>
+        </w:rPr>
+      </w:pPr>
+      <w:r>
+        <w:rPr>
+          <w:rStyle w:val="Strong"/>
+          <w:b w:val="0"/>
+          <w:bCs w:val="0"/>
+        </w:rPr>
+        <w:t>Ensure all non-permission species have either images or temporaily hide them</w:t>
+      </w:r>
+    </w:p>
+    <w:p>
+      <w:pPr>
+        <w:pStyle w:val="font-claude-response-body"/>
+        <w:rPr>
+          <w:rStyle w:val="Strong"/>
+          <w:b w:val="0"/>
+          <w:bCs w:val="0"/>
+        </w:rPr>
+      </w:pPr>
+    </w:p>
+    <w:p>
+      <w:pPr>
+        <w:pStyle w:val="font-claude-response-body"/>
         <w:rPr>
           <w:rStyle w:val="Strong"/>
           <w:b w:val="0"/>
@@ -857,47 +848,37 @@
     </w:p>
     <w:p>
       <w:pPr>
-        <w:rPr>
-          <w:rStyle w:val="Strong"/>
-          <w:rFonts w:asciiTheme="majorHAnsi" w:eastAsiaTheme="majorEastAsia" w:hAnsiTheme="majorHAnsi" w:cstheme="majorBidi"/>
-          <w:b w:val="0"/>
-          <w:bCs w:val="0"/>
-          <w:color w:val="0F4761" w:themeColor="accent1" w:themeShade="BF"/>
-        </w:rPr>
-      </w:pPr>
-      <w:r>
         <w:rPr>
           <w:rStyle w:val="Heading1Char"/>
           <w:sz w:val="24"/>
           <w:szCs w:val="24"/>
         </w:rPr>
-        <w:t xml:space="preserve">Rebuild Snakes of </w:t>
-      </w:r>
-      <w:proofErr w:type="spellStart"/>
+      </w:pPr>
       <w:r>
         <w:rPr>
           <w:rStyle w:val="Heading1Char"/>
           <w:sz w:val="24"/>
           <w:szCs w:val="24"/>
         </w:rPr>
-        <w:t>Carajas</w:t>
-      </w:r>
-      <w:proofErr w:type="spellEnd"/>
+        <w:t xml:space="preserve">Rebuild Snakes of </w:t>
+      </w:r>
+      <w:proofErr w:type="spellStart"/>
       <w:r>
         <w:rPr>
           <w:rStyle w:val="Heading1Char"/>
           <w:sz w:val="24"/>
           <w:szCs w:val="24"/>
         </w:rPr>
-        <w:t xml:space="preserve"> in React or Flutter </w:t>
-      </w:r>
+        <w:t>Carajas</w:t>
+      </w:r>
+      <w:proofErr w:type="spellEnd"/>
       <w:r>
         <w:rPr>
           <w:rStyle w:val="Heading1Char"/>
           <w:sz w:val="24"/>
           <w:szCs w:val="24"/>
         </w:rPr>
-        <w:t>f</w:t>
+        <w:t xml:space="preserve"> in React or Flutter </w:t>
       </w:r>
       <w:r>
         <w:rPr>
@@ -905,7 +886,7 @@
           <w:sz w:val="24"/>
           <w:szCs w:val="24"/>
         </w:rPr>
-        <w:t xml:space="preserve">or iOS &amp; android </w:t>
+        <w:t>f</w:t>
       </w:r>
       <w:r>
         <w:rPr>
@@ -913,8 +894,76 @@
           <w:sz w:val="24"/>
           <w:szCs w:val="24"/>
         </w:rPr>
+        <w:t xml:space="preserve">or iOS &amp; android </w:t>
+      </w:r>
+      <w:r>
+        <w:rPr>
+          <w:rStyle w:val="Heading1Char"/>
+          <w:sz w:val="24"/>
+          <w:szCs w:val="24"/>
+        </w:rPr>
         <w:t>stores</w:t>
       </w:r>
+    </w:p>
+    <w:p>
+      <w:pPr>
+        <w:rPr>
+          <w:rStyle w:val="Strong"/>
+          <w:rFonts w:asciiTheme="majorHAnsi" w:eastAsiaTheme="majorEastAsia" w:hAnsiTheme="majorHAnsi" w:cstheme="majorBidi"/>
+          <w:b w:val="0"/>
+          <w:bCs w:val="0"/>
+          <w:color w:val="0F4761" w:themeColor="accent1" w:themeShade="BF"/>
+          <w:sz w:val="40"/>
+          <w:szCs w:val="40"/>
+        </w:rPr>
+      </w:pPr>
+      <w:r>
+        <w:rPr>
+          <w:rStyle w:val="Heading1Char"/>
+        </w:rPr>
+        <w:t>Sprint 6</w:t>
+      </w:r>
+    </w:p>
+    <w:p>
+      <w:pPr>
+        <w:pStyle w:val="font-claude-response-body"/>
+        <w:numPr>
+          <w:ilvl w:val="0"/>
+          <w:numId w:val="11"/>
+        </w:numPr>
+        <w:rPr>
+          <w:rStyle w:val="Strong"/>
+          <w:b w:val="0"/>
+          <w:bCs w:val="0"/>
+        </w:rPr>
+      </w:pPr>
+      <w:r>
+        <w:rPr>
+          <w:rStyle w:val="Strong"/>
+          <w:b w:val="0"/>
+          <w:bCs w:val="0"/>
+        </w:rPr>
+        <w:t xml:space="preserve">Add a pop-up after a little use with a “how are you finding the app” – if they user says “awsome” prompt user to </w:t>
+      </w:r>
+      <w:r>
+        <w:rPr>
+          <w:rStyle w:val="Strong"/>
+          <w:b w:val="0"/>
+          <w:bCs w:val="0"/>
+        </w:rPr>
+        <w:t>rate the app, otherwise ask for how we can improve it.</w:t>
+      </w:r>
+    </w:p>
+    <w:p>
+      <w:pPr>
+        <w:rPr>
+          <w:rStyle w:val="Strong"/>
+          <w:rFonts w:asciiTheme="majorHAnsi" w:eastAsiaTheme="majorEastAsia" w:hAnsiTheme="majorHAnsi" w:cstheme="majorBidi"/>
+          <w:b w:val="0"/>
+          <w:bCs w:val="0"/>
+          <w:color w:val="0F4761" w:themeColor="accent1" w:themeShade="BF"/>
+        </w:rPr>
+      </w:pPr>
     </w:p>
     <w:p>
       <w:pPr>
@@ -1280,10 +1329,40 @@
     <w:p>
       <w:pPr>
         <w:pStyle w:val="font-claude-response-body"/>
+        <w:ind w:left="720"/>
+        <w:rPr>
+          <w:rStyle w:val="Strong"/>
+          <w:b w:val="0"/>
+          <w:bCs w:val="0"/>
+        </w:rPr>
+      </w:pPr>
+    </w:p>
+    <w:p>
+      <w:pPr>
+        <w:pStyle w:val="font-claude-response-body"/>
         <w:numPr>
           <w:ilvl w:val="0"/>
-          <w:numId w:val="7"/>
-        </w:numPr>
+          <w:numId w:val="11"/>
+        </w:numPr>
+        <w:rPr>
+          <w:rStyle w:val="Strong"/>
+          <w:b w:val="0"/>
+          <w:bCs w:val="0"/>
+        </w:rPr>
+      </w:pPr>
+      <w:r>
+        <w:rPr>
+          <w:rStyle w:val="Strong"/>
+          <w:b w:val="0"/>
+          <w:bCs w:val="0"/>
+        </w:rPr>
+        <w:t>Ability to upload custom user images</w:t>
+      </w:r>
+    </w:p>
+    <w:p>
+      <w:pPr>
+        <w:pStyle w:val="font-claude-response-body"/>
+        <w:ind w:left="720"/>
         <w:rPr>
           <w:rStyle w:val="Strong"/>
           <w:b w:val="0"/>
@@ -1388,7 +1467,6 @@
         </w:numPr>
       </w:pPr>
       <w:r>
-        <w:lastRenderedPageBreak/>
         <w:t>Attach the current handover doc + MasterDoc_0_3.docx</w:t>
       </w:r>
     </w:p>
@@ -1825,6 +1903,92 @@
     </w:lvl>
   </w:abstractNum>
   <w:abstractNum w:abstractNumId="3" w15:restartNumberingAfterBreak="0">
+    <w:nsid w:val="327C041C"/>
+    <w:multiLevelType w:val="hybridMultilevel"/>
+    <w:tmpl w:val="D9BCA178"/>
+    <w:lvl w:ilvl="0" w:tplc="FFFFFFFF">
+      <w:start w:val="1"/>
+      <w:numFmt w:val="decimal"/>
+      <w:lvlText w:val="%1."/>
+      <w:lvlJc w:val="left"/>
+      <w:pPr>
+        <w:ind w:left="720" w:hanging="360"/>
+      </w:pPr>
+    </w:lvl>
+    <w:lvl w:ilvl="1" w:tplc="FFFFFFFF">
+      <w:start w:val="1"/>
+      <w:numFmt w:val="lowerLetter"/>
+      <w:lvlText w:val="%2."/>
+      <w:lvlJc w:val="left"/>
+      <w:pPr>
+        <w:ind w:left="1440" w:hanging="360"/>
+      </w:pPr>
+    </w:lvl>
+    <w:lvl w:ilvl="2" w:tplc="FFFFFFFF">
+      <w:start w:val="1"/>
+      <w:numFmt w:val="lowerRoman"/>
+      <w:lvlText w:val="%3."/>
+      <w:lvlJc w:val="right"/>
+      <w:pPr>
+        <w:ind w:left="2160" w:hanging="180"/>
+      </w:pPr>
+    </w:lvl>
+    <w:lvl w:ilvl="3" w:tplc="FFFFFFFF" w:tentative="1">
+      <w:start w:val="1"/>
+      <w:numFmt w:val="decimal"/>
+      <w:lvlText w:val="%4."/>
+      <w:lvlJc w:val="left"/>
+      <w:pPr>
+        <w:ind w:left="2880" w:hanging="360"/>
+      </w:pPr>
+    </w:lvl>
+    <w:lvl w:ilvl="4" w:tplc="FFFFFFFF" w:tentative="1">
+      <w:start w:val="1"/>
+      <w:numFmt w:val="lowerLetter"/>
+      <w:lvlText w:val="%5."/>
+      <w:lvlJc w:val="left"/>
+      <w:pPr>
+        <w:ind w:left="3600" w:hanging="360"/>
+      </w:pPr>
+    </w:lvl>
+    <w:lvl w:ilvl="5" w:tplc="FFFFFFFF" w:tentative="1">
+      <w:start w:val="1"/>
+      <w:numFmt w:val="lowerRoman"/>
+      <w:lvlText w:val="%6."/>
+      <w:lvlJc w:val="right"/>
+      <w:pPr>
+        <w:ind w:left="4320" w:hanging="180"/>
+      </w:pPr>
+    </w:lvl>
+    <w:lvl w:ilvl="6" w:tplc="FFFFFFFF" w:tentative="1">
+      <w:start w:val="1"/>
+      <w:numFmt w:val="decimal"/>
+      <w:lvlText w:val="%7."/>
+      <w:lvlJc w:val="left"/>
+      <w:pPr>
+        <w:ind w:left="5040" w:hanging="360"/>
+      </w:pPr>
+    </w:lvl>
+    <w:lvl w:ilvl="7" w:tplc="FFFFFFFF" w:tentative="1">
+      <w:start w:val="1"/>
+      <w:numFmt w:val="lowerLetter"/>
+      <w:lvlText w:val="%8."/>
+      <w:lvlJc w:val="left"/>
+      <w:pPr>
+        <w:ind w:left="5760" w:hanging="360"/>
+      </w:pPr>
+    </w:lvl>
+    <w:lvl w:ilvl="8" w:tplc="FFFFFFFF" w:tentative="1">
+      <w:start w:val="1"/>
+      <w:numFmt w:val="lowerRoman"/>
+      <w:lvlText w:val="%9."/>
+      <w:lvlJc w:val="right"/>
+      <w:pPr>
+        <w:ind w:left="6480" w:hanging="180"/>
+      </w:pPr>
+    </w:lvl>
+  </w:abstractNum>
+  <w:abstractNum w:abstractNumId="4" w15:restartNumberingAfterBreak="0">
     <w:nsid w:val="374B7A7D"/>
     <w:multiLevelType w:val="hybridMultilevel"/>
     <w:tmpl w:val="A4DE56BE"/>
@@ -1910,7 +2074,93 @@
       </w:pPr>
     </w:lvl>
   </w:abstractNum>
-  <w:abstractNum w:abstractNumId="4" w15:restartNumberingAfterBreak="0">
+  <w:abstractNum w:abstractNumId="5" w15:restartNumberingAfterBreak="0">
+    <w:nsid w:val="420801C5"/>
+    <w:multiLevelType w:val="hybridMultilevel"/>
+    <w:tmpl w:val="A4DE56BE"/>
+    <w:lvl w:ilvl="0" w:tplc="FFFFFFFF">
+      <w:start w:val="1"/>
+      <w:numFmt w:val="decimal"/>
+      <w:lvlText w:val="%1."/>
+      <w:lvlJc w:val="left"/>
+      <w:pPr>
+        <w:ind w:left="720" w:hanging="360"/>
+      </w:pPr>
+    </w:lvl>
+    <w:lvl w:ilvl="1" w:tplc="FFFFFFFF">
+      <w:start w:val="1"/>
+      <w:numFmt w:val="lowerLetter"/>
+      <w:lvlText w:val="%2."/>
+      <w:lvlJc w:val="left"/>
+      <w:pPr>
+        <w:ind w:left="1440" w:hanging="360"/>
+      </w:pPr>
+    </w:lvl>
+    <w:lvl w:ilvl="2" w:tplc="FFFFFFFF" w:tentative="1">
+      <w:start w:val="1"/>
+      <w:numFmt w:val="lowerRoman"/>
+      <w:lvlText w:val="%3."/>
+      <w:lvlJc w:val="right"/>
+      <w:pPr>
+        <w:ind w:left="2160" w:hanging="180"/>
+      </w:pPr>
+    </w:lvl>
+    <w:lvl w:ilvl="3" w:tplc="FFFFFFFF" w:tentative="1">
+      <w:start w:val="1"/>
+      <w:numFmt w:val="decimal"/>
+      <w:lvlText w:val="%4."/>
+      <w:lvlJc w:val="left"/>
+      <w:pPr>
+        <w:ind w:left="2880" w:hanging="360"/>
+      </w:pPr>
+    </w:lvl>
+    <w:lvl w:ilvl="4" w:tplc="FFFFFFFF" w:tentative="1">
+      <w:start w:val="1"/>
+      <w:numFmt w:val="lowerLetter"/>
+      <w:lvlText w:val="%5."/>
+      <w:lvlJc w:val="left"/>
+      <w:pPr>
+        <w:ind w:left="3600" w:hanging="360"/>
+      </w:pPr>
+    </w:lvl>
+    <w:lvl w:ilvl="5" w:tplc="FFFFFFFF" w:tentative="1">
+      <w:start w:val="1"/>
+      <w:numFmt w:val="lowerRoman"/>
+      <w:lvlText w:val="%6."/>
+      <w:lvlJc w:val="right"/>
+      <w:pPr>
+        <w:ind w:left="4320" w:hanging="180"/>
+      </w:pPr>
+    </w:lvl>
+    <w:lvl w:ilvl="6" w:tplc="FFFFFFFF" w:tentative="1">
+      <w:start w:val="1"/>
+      <w:numFmt w:val="decimal"/>
+      <w:lvlText w:val="%7."/>
+      <w:lvlJc w:val="left"/>
+      <w:pPr>
+        <w:ind w:left="5040" w:hanging="360"/>
+      </w:pPr>
+    </w:lvl>
+    <w:lvl w:ilvl="7" w:tplc="FFFFFFFF" w:tentative="1">
+      <w:start w:val="1"/>
+      <w:numFmt w:val="lowerLetter"/>
+      <w:lvlText w:val="%8."/>
+      <w:lvlJc w:val="left"/>
+      <w:pPr>
+        <w:ind w:left="5760" w:hanging="360"/>
+      </w:pPr>
+    </w:lvl>
+    <w:lvl w:ilvl="8" w:tplc="FFFFFFFF" w:tentative="1">
+      <w:start w:val="1"/>
+      <w:numFmt w:val="lowerRoman"/>
+      <w:lvlText w:val="%9."/>
+      <w:lvlJc w:val="right"/>
+      <w:pPr>
+        <w:ind w:left="6480" w:hanging="180"/>
+      </w:pPr>
+    </w:lvl>
+  </w:abstractNum>
+  <w:abstractNum w:abstractNumId="6" w15:restartNumberingAfterBreak="0">
     <w:nsid w:val="42382851"/>
     <w:multiLevelType w:val="multilevel"/>
     <w:tmpl w:val="B75494A0"/>
@@ -2023,7 +2273,7 @@
       </w:pPr>
     </w:lvl>
   </w:abstractNum>
-  <w:abstractNum w:abstractNumId="5" w15:restartNumberingAfterBreak="0">
+  <w:abstractNum w:abstractNumId="7" w15:restartNumberingAfterBreak="0">
     <w:nsid w:val="472C156B"/>
     <w:multiLevelType w:val="hybridMultilevel"/>
     <w:tmpl w:val="D9BCA178"/>
@@ -2109,7 +2359,93 @@
       </w:pPr>
     </w:lvl>
   </w:abstractNum>
-  <w:abstractNum w:abstractNumId="6" w15:restartNumberingAfterBreak="0">
+  <w:abstractNum w:abstractNumId="8" w15:restartNumberingAfterBreak="0">
+    <w:nsid w:val="593645E5"/>
+    <w:multiLevelType w:val="hybridMultilevel"/>
+    <w:tmpl w:val="D9BCA178"/>
+    <w:lvl w:ilvl="0" w:tplc="FFFFFFFF">
+      <w:start w:val="1"/>
+      <w:numFmt w:val="decimal"/>
+      <w:lvlText w:val="%1."/>
+      <w:lvlJc w:val="left"/>
+      <w:pPr>
+        <w:ind w:left="720" w:hanging="360"/>
+      </w:pPr>
+    </w:lvl>
+    <w:lvl w:ilvl="1" w:tplc="FFFFFFFF">
+      <w:start w:val="1"/>
+      <w:numFmt w:val="lowerLetter"/>
+      <w:lvlText w:val="%2."/>
+      <w:lvlJc w:val="left"/>
+      <w:pPr>
+        <w:ind w:left="1440" w:hanging="360"/>
+      </w:pPr>
+    </w:lvl>
+    <w:lvl w:ilvl="2" w:tplc="FFFFFFFF">
+      <w:start w:val="1"/>
+      <w:numFmt w:val="lowerRoman"/>
+      <w:lvlText w:val="%3."/>
+      <w:lvlJc w:val="right"/>
+      <w:pPr>
+        <w:ind w:left="2160" w:hanging="180"/>
+      </w:pPr>
+    </w:lvl>
+    <w:lvl w:ilvl="3" w:tplc="FFFFFFFF" w:tentative="1">
+      <w:start w:val="1"/>
+      <w:numFmt w:val="decimal"/>
+      <w:lvlText w:val="%4."/>
+      <w:lvlJc w:val="left"/>
+      <w:pPr>
+        <w:ind w:left="2880" w:hanging="360"/>
+      </w:pPr>
+    </w:lvl>
+    <w:lvl w:ilvl="4" w:tplc="FFFFFFFF" w:tentative="1">
+      <w:start w:val="1"/>
+      <w:numFmt w:val="lowerLetter"/>
+      <w:lvlText w:val="%5."/>
+      <w:lvlJc w:val="left"/>
+      <w:pPr>
+        <w:ind w:left="3600" w:hanging="360"/>
+      </w:pPr>
+    </w:lvl>
+    <w:lvl w:ilvl="5" w:tplc="FFFFFFFF" w:tentative="1">
+      <w:start w:val="1"/>
+      <w:numFmt w:val="lowerRoman"/>
+      <w:lvlText w:val="%6."/>
+      <w:lvlJc w:val="right"/>
+      <w:pPr>
+        <w:ind w:left="4320" w:hanging="180"/>
+      </w:pPr>
+    </w:lvl>
+    <w:lvl w:ilvl="6" w:tplc="FFFFFFFF" w:tentative="1">
+      <w:start w:val="1"/>
+      <w:numFmt w:val="decimal"/>
+      <w:lvlText w:val="%7."/>
+      <w:lvlJc w:val="left"/>
+      <w:pPr>
+        <w:ind w:left="5040" w:hanging="360"/>
+      </w:pPr>
+    </w:lvl>
+    <w:lvl w:ilvl="7" w:tplc="FFFFFFFF" w:tentative="1">
+      <w:start w:val="1"/>
+      <w:numFmt w:val="lowerLetter"/>
+      <w:lvlText w:val="%8."/>
+      <w:lvlJc w:val="left"/>
+      <w:pPr>
+        <w:ind w:left="5760" w:hanging="360"/>
+      </w:pPr>
+    </w:lvl>
+    <w:lvl w:ilvl="8" w:tplc="FFFFFFFF" w:tentative="1">
+      <w:start w:val="1"/>
+      <w:numFmt w:val="lowerRoman"/>
+      <w:lvlText w:val="%9."/>
+      <w:lvlJc w:val="right"/>
+      <w:pPr>
+        <w:ind w:left="6480" w:hanging="180"/>
+      </w:pPr>
+    </w:lvl>
+  </w:abstractNum>
+  <w:abstractNum w:abstractNumId="9" w15:restartNumberingAfterBreak="0">
     <w:nsid w:val="66272C06"/>
     <w:multiLevelType w:val="hybridMultilevel"/>
     <w:tmpl w:val="583C7C30"/>
@@ -2195,7 +2531,7 @@
       </w:pPr>
     </w:lvl>
   </w:abstractNum>
-  <w:abstractNum w:abstractNumId="7" w15:restartNumberingAfterBreak="0">
+  <w:abstractNum w:abstractNumId="10" w15:restartNumberingAfterBreak="0">
     <w:nsid w:val="68D04445"/>
     <w:multiLevelType w:val="hybridMultilevel"/>
     <w:tmpl w:val="9118B76C"/>
@@ -2312,25 +2648,34 @@
     <w:abstractNumId w:val="2"/>
   </w:num>
   <w:num w:numId="2" w16cid:durableId="1916621718">
-    <w:abstractNumId w:val="7"/>
+    <w:abstractNumId w:val="10"/>
   </w:num>
   <w:num w:numId="3" w16cid:durableId="356127680">
-    <w:abstractNumId w:val="4"/>
+    <w:abstractNumId w:val="6"/>
   </w:num>
   <w:num w:numId="4" w16cid:durableId="1830443274">
     <w:abstractNumId w:val="0"/>
   </w:num>
   <w:num w:numId="5" w16cid:durableId="945817518">
-    <w:abstractNumId w:val="5"/>
+    <w:abstractNumId w:val="7"/>
   </w:num>
   <w:num w:numId="6" w16cid:durableId="1749377612">
-    <w:abstractNumId w:val="3"/>
+    <w:abstractNumId w:val="4"/>
   </w:num>
   <w:num w:numId="7" w16cid:durableId="108625824">
-    <w:abstractNumId w:val="6"/>
+    <w:abstractNumId w:val="9"/>
   </w:num>
   <w:num w:numId="8" w16cid:durableId="335037962">
     <w:abstractNumId w:val="1"/>
+  </w:num>
+  <w:num w:numId="9" w16cid:durableId="1396930163">
+    <w:abstractNumId w:val="3"/>
+  </w:num>
+  <w:num w:numId="10" w16cid:durableId="466703854">
+    <w:abstractNumId w:val="8"/>
+  </w:num>
+  <w:num w:numId="11" w16cid:durableId="408429026">
+    <w:abstractNumId w:val="5"/>
   </w:num>
 </w:numbering>
 </file>

</xml_diff>